<commit_message>
updated the collab plab
</commit_message>
<xml_diff>
--- a/01_Meeting_Minutes.docx
+++ b/01_Meeting_Minutes.docx
@@ -1255,7 +1255,14 @@
                 <w:sz w:val="20"/>
                 <w:szCs w:val="20"/>
               </w:rPr>
-              <w:t>Lab02</w:t>
+              <w:t>Lab0</w:t>
+            </w:r>
+            <w:r>
+              <w:rPr>
+                <w:sz w:val="20"/>
+                <w:szCs w:val="20"/>
+              </w:rPr>
+              <w:t>1</w:t>
             </w:r>
           </w:p>
         </w:tc>
@@ -1281,7 +1288,14 @@
                 <w:sz w:val="20"/>
                 <w:szCs w:val="20"/>
               </w:rPr>
-              <w:t>Lab01</w:t>
+              <w:t>Lab0</w:t>
+            </w:r>
+            <w:r>
+              <w:rPr>
+                <w:sz w:val="20"/>
+                <w:szCs w:val="20"/>
+              </w:rPr>
+              <w:t>2</w:t>
             </w:r>
           </w:p>
         </w:tc>

</xml_diff>